<commit_message>
Exports: proportional table columns, full-width figures outside PDF, Word cell alignment fix
</commit_message>
<xml_diff>
--- a/report.docx
+++ b/report.docx
@@ -592,9 +592,9 @@
               <w:tblLook w:firstRow="1" w:lastRow="0" w:firstColumn="0" w:lastColumn="0" w:noHBand="0" w:noVBand="0" w:val="0020"/>
             </w:tblPr>
             <w:tblGrid>
-              <w:gridCol w:w="3168"/>
-              <w:gridCol w:w="2376"/>
-              <w:gridCol w:w="2376"/>
+              <w:gridCol w:w="761"/>
+              <w:gridCol w:w="3350"/>
+              <w:gridCol w:w="3807"/>
             </w:tblGrid>
             <w:tr>
               <w:trPr>
@@ -606,7 +606,6 @@
                   <w:pPr>
                     <w:pStyle w:val="Compact"/>
                     <w:jc w:val="center"/>
-                    <w:jc w:val="center"/>
                   </w:pPr>
                   <w:r>
                     <w:t xml:space="preserve">step</w:t>
@@ -619,7 +618,6 @@
                   <w:pPr>
                     <w:pStyle w:val="Compact"/>
                     <w:jc w:val="left"/>
-                    <w:jc w:val="center"/>
                   </w:pPr>
                   <w:r>
                     <w:t xml:space="preserve">what changes</w:t>
@@ -632,7 +630,6 @@
                   <w:pPr>
                     <w:pStyle w:val="Compact"/>
                     <w:jc w:val="left"/>
-                    <w:jc w:val="center"/>
                   </w:pPr>
                   <w:r>
                     <w:t xml:space="preserve">the question</w:t>
@@ -647,7 +644,6 @@
                   <w:pPr>
                     <w:pStyle w:val="Compact"/>
                     <w:jc w:val="center"/>
-                    <w:jc w:val="center"/>
                   </w:pPr>
                   <w:r>
                     <w:t xml:space="preserve">0</w:t>
@@ -660,7 +656,6 @@
                   <w:pPr>
                     <w:pStyle w:val="Compact"/>
                     <w:jc w:val="left"/>
-                    <w:jc w:val="center"/>
                   </w:pPr>
                   <w:r>
                     <w:t xml:space="preserve">Nothing trained. The published detector as designed, one scan.</w:t>
@@ -673,7 +668,6 @@
                   <w:pPr>
                     <w:pStyle w:val="Compact"/>
                     <w:jc w:val="left"/>
-                    <w:jc w:val="center"/>
                   </w:pPr>
                   <w:r>
                     <w:t xml:space="preserve">What does it already give? On the onset task, the newest observed scan is the floor and the real future scan the ceiling.</w:t>
@@ -688,7 +682,6 @@
                   <w:pPr>
                     <w:pStyle w:val="Compact"/>
                     <w:jc w:val="center"/>
-                    <w:jc w:val="center"/>
                   </w:pPr>
                   <w:r>
                     <w:t xml:space="preserve">1</w:t>
@@ -701,7 +694,6 @@
                   <w:pPr>
                     <w:pStyle w:val="Compact"/>
                     <w:jc w:val="left"/>
-                    <w:jc w:val="center"/>
                   </w:pPr>
                   <w:r>
                     <w:t xml:space="preserve">A new linear head on the frozen features, current scan, detection target.</w:t>
@@ -714,7 +706,6 @@
                   <w:pPr>
                     <w:pStyle w:val="Compact"/>
                     <w:jc w:val="left"/>
-                    <w:jc w:val="center"/>
                   </w:pPr>
                   <w:r>
                     <w:t xml:space="preserve">Can a retrained head beat the detector at its own job?</w:t>
@@ -729,7 +720,6 @@
                   <w:pPr>
                     <w:pStyle w:val="Compact"/>
                     <w:jc w:val="center"/>
-                    <w:jc w:val="center"/>
                   </w:pPr>
                   <w:r>
                     <w:t xml:space="preserve">2</w:t>
@@ -742,7 +732,6 @@
                   <w:pPr>
                     <w:pStyle w:val="Compact"/>
                     <w:jc w:val="left"/>
-                    <w:jc w:val="center"/>
                   </w:pPr>
                   <w:r>
                     <w:t xml:space="preserve">The scan five minutes earlier added, features averaged.</w:t>
@@ -755,7 +744,6 @@
                   <w:pPr>
                     <w:pStyle w:val="Compact"/>
                     <w:jc w:val="left"/>
-                    <w:jc w:val="center"/>
                   </w:pPr>
                   <w:r>
                     <w:t xml:space="preserve">Does a second scan carry anything the first doesn’t?</w:t>
@@ -770,7 +758,6 @@
                   <w:pPr>
                     <w:pStyle w:val="Compact"/>
                     <w:jc w:val="center"/>
-                    <w:jc w:val="center"/>
                   </w:pPr>
                   <w:r>
                     <w:t xml:space="preserve">3</w:t>
@@ -783,7 +770,6 @@
                   <w:pPr>
                     <w:pStyle w:val="Compact"/>
                     <w:jc w:val="left"/>
-                    <w:jc w:val="center"/>
                   </w:pPr>
                   <w:r>
                     <w:t xml:space="preserve">Frozen CNN, both scans concatenated, the authors’ head retrained on the +5 and +10 labels.</w:t>
@@ -796,7 +782,6 @@
                   <w:pPr>
                     <w:pStyle w:val="Compact"/>
                     <w:jc w:val="left"/>
-                    <w:jc w:val="center"/>
                   </w:pPr>
                   <w:r>
                     <w:t xml:space="preserve">Can the detector’s own features be re-aimed at</w:t>
@@ -820,7 +805,6 @@
                   <w:pPr>
                     <w:pStyle w:val="Compact"/>
                     <w:jc w:val="center"/>
-                    <w:jc w:val="center"/>
                   </w:pPr>
                   <w:r>
                     <w:t xml:space="preserve">4</w:t>
@@ -833,7 +817,6 @@
                   <w:pPr>
                     <w:pStyle w:val="Compact"/>
                     <w:jc w:val="left"/>
-                    <w:jc w:val="center"/>
                   </w:pPr>
                   <w:r>
                     <w:t xml:space="preserve">The CNN unfrozen at a tenth of the head’s learning rate.</w:t>
@@ -846,7 +829,6 @@
                   <w:pPr>
                     <w:pStyle w:val="Compact"/>
                     <w:jc w:val="left"/>
-                    <w:jc w:val="center"/>
                   </w:pPr>
                   <w:r>
                     <w:t xml:space="preserve">Does adapting the features to the target buy more?</w:t>
@@ -940,10 +922,10 @@
               <w:tblLook w:firstRow="1" w:lastRow="0" w:firstColumn="0" w:lastColumn="0" w:noHBand="0" w:noVBand="0" w:val="0020"/>
             </w:tblPr>
             <w:tblGrid>
-              <w:gridCol w:w="1697"/>
-              <w:gridCol w:w="2262"/>
-              <w:gridCol w:w="2262"/>
-              <w:gridCol w:w="1697"/>
+              <w:gridCol w:w="2640"/>
+              <w:gridCol w:w="1466"/>
+              <w:gridCol w:w="1173"/>
+              <w:gridCol w:w="2640"/>
             </w:tblGrid>
             <w:tr>
               <w:trPr>
@@ -955,10 +937,21 @@
                   <w:pPr>
                     <w:pStyle w:val="Compact"/>
                     <w:jc w:val="left"/>
+                  </w:pPr>
+                  <w:r>
+                    <w:t xml:space="preserve">configuration</w:t>
+                  </w:r>
+                </w:p>
+              </w:tc>
+              <w:tc>
+                <w:tcPr/>
+                <w:p>
+                  <w:pPr>
+                    <w:pStyle w:val="Compact"/>
                     <w:jc w:val="center"/>
                   </w:pPr>
                   <w:r>
-                    <w:t xml:space="preserve">configuration</w:t>
+                    <w:t xml:space="preserve">validation AP (3 seeds)</w:t>
                   </w:r>
                 </w:p>
               </w:tc>
@@ -968,20 +961,6 @@
                   <w:pPr>
                     <w:pStyle w:val="Compact"/>
                     <w:jc w:val="center"/>
-                    <w:jc w:val="center"/>
-                  </w:pPr>
-                  <w:r>
-                    <w:t xml:space="preserve">validation AP (3 seeds)</w:t>
-                  </w:r>
-                </w:p>
-              </w:tc>
-              <w:tc>
-                <w:tcPr/>
-                <w:p>
-                  <w:pPr>
-                    <w:pStyle w:val="Compact"/>
-                    <w:jc w:val="center"/>
-                    <w:jc w:val="center"/>
                   </w:pPr>
                   <w:r>
                     <w:t xml:space="preserve">test AP</w:t>
@@ -994,7 +973,6 @@
                   <w:pPr>
                     <w:pStyle w:val="Compact"/>
                     <w:jc w:val="left"/>
-                    <w:jc w:val="center"/>
                   </w:pPr>
                   <w:r>
                     <w:t xml:space="preserve">at the locked threshold</w:t>
@@ -1009,30 +987,28 @@
                   <w:pPr>
                     <w:pStyle w:val="Compact"/>
                     <w:jc w:val="left"/>
+                  </w:pPr>
+                  <w:r>
+                    <w:t xml:space="preserve">original pretrained CNN</w:t>
+                  </w:r>
+                </w:p>
+              </w:tc>
+              <w:tc>
+                <w:tcPr/>
+                <w:p>
+                  <w:pPr>
+                    <w:pStyle w:val="Compact"/>
+                  </w:pPr>
+                </w:p>
+              </w:tc>
+              <w:tc>
+                <w:tcPr/>
+                <w:p>
+                  <w:pPr>
+                    <w:pStyle w:val="Compact"/>
                     <w:jc w:val="center"/>
                   </w:pPr>
                   <w:r>
-                    <w:t xml:space="preserve">original pretrained CNN</w:t>
-                  </w:r>
-                </w:p>
-              </w:tc>
-              <w:tc>
-                <w:tcPr/>
-                <w:p>
-                  <w:pPr>
-                    <w:pStyle w:val="Compact"/>
-                  </w:pPr>
-                </w:p>
-              </w:tc>
-              <w:tc>
-                <w:tcPr/>
-                <w:p>
-                  <w:pPr>
-                    <w:pStyle w:val="Compact"/>
-                    <w:jc w:val="center"/>
-                    <w:jc w:val="center"/>
-                  </w:pPr>
-                  <w:r>
                     <w:t xml:space="preserve">0.517</w:t>
                   </w:r>
                 </w:p>
@@ -1043,7 +1019,6 @@
                   <w:pPr>
                     <w:pStyle w:val="Compact"/>
                     <w:jc w:val="left"/>
-                    <w:jc w:val="center"/>
                   </w:pPr>
                   <w:r>
                     <w:t xml:space="preserve">68 of 89 found, 276 false alarms</w:t>
@@ -1058,10 +1033,21 @@
                   <w:pPr>
                     <w:pStyle w:val="Compact"/>
                     <w:jc w:val="left"/>
+                  </w:pPr>
+                  <w:r>
+                    <w:t xml:space="preserve">step 1: current scan, linear head</w:t>
+                  </w:r>
+                </w:p>
+              </w:tc>
+              <w:tc>
+                <w:tcPr/>
+                <w:p>
+                  <w:pPr>
+                    <w:pStyle w:val="Compact"/>
                     <w:jc w:val="center"/>
                   </w:pPr>
                   <w:r>
-                    <w:t xml:space="preserve">step 1: current scan, linear head</w:t>
+                    <w:t xml:space="preserve">0.658 ± 0.005</w:t>
                   </w:r>
                 </w:p>
               </w:tc>
@@ -1071,20 +1057,6 @@
                   <w:pPr>
                     <w:pStyle w:val="Compact"/>
                     <w:jc w:val="center"/>
-                    <w:jc w:val="center"/>
-                  </w:pPr>
-                  <w:r>
-                    <w:t xml:space="preserve">0.658 ± 0.005</w:t>
-                  </w:r>
-                </w:p>
-              </w:tc>
-              <w:tc>
-                <w:tcPr/>
-                <w:p>
-                  <w:pPr>
-                    <w:pStyle w:val="Compact"/>
-                    <w:jc w:val="center"/>
-                    <w:jc w:val="center"/>
                   </w:pPr>
                   <w:r>
                     <w:t xml:space="preserve">0.508</w:t>
@@ -1097,7 +1069,6 @@
                   <w:pPr>
                     <w:pStyle w:val="Compact"/>
                     <w:jc w:val="left"/>
-                    <w:jc w:val="center"/>
                   </w:pPr>
                   <w:r>
                     <w:t xml:space="preserve">70 found, 571 false alarms</w:t>
@@ -1112,10 +1083,21 @@
                   <w:pPr>
                     <w:pStyle w:val="Compact"/>
                     <w:jc w:val="left"/>
+                  </w:pPr>
+                  <w:r>
+                    <w:t xml:space="preserve">step 2: two-scan mean, linear head</w:t>
+                  </w:r>
+                </w:p>
+              </w:tc>
+              <w:tc>
+                <w:tcPr/>
+                <w:p>
+                  <w:pPr>
+                    <w:pStyle w:val="Compact"/>
                     <w:jc w:val="center"/>
                   </w:pPr>
                   <w:r>
-                    <w:t xml:space="preserve">step 2: two-scan mean, linear head</w:t>
+                    <w:t xml:space="preserve">0.675 ± 0.001</w:t>
                   </w:r>
                 </w:p>
               </w:tc>
@@ -1125,20 +1107,6 @@
                   <w:pPr>
                     <w:pStyle w:val="Compact"/>
                     <w:jc w:val="center"/>
-                    <w:jc w:val="center"/>
-                  </w:pPr>
-                  <w:r>
-                    <w:t xml:space="preserve">0.675 ± 0.001</w:t>
-                  </w:r>
-                </w:p>
-              </w:tc>
-              <w:tc>
-                <w:tcPr/>
-                <w:p>
-                  <w:pPr>
-                    <w:pStyle w:val="Compact"/>
-                    <w:jc w:val="center"/>
-                    <w:jc w:val="center"/>
                   </w:pPr>
                   <w:r>
                     <w:t xml:space="preserve">0.548</w:t>
@@ -1151,7 +1119,6 @@
                   <w:pPr>
                     <w:pStyle w:val="Compact"/>
                     <w:jc w:val="left"/>
-                    <w:jc w:val="center"/>
                   </w:pPr>
                   <w:r>
                     <w:t xml:space="preserve">69 found, 564 false alarms</w:t>
@@ -1166,22 +1133,20 @@
                   <w:pPr>
                     <w:pStyle w:val="Compact"/>
                     <w:jc w:val="left"/>
+                  </w:pPr>
+                  <w:r>
+                    <w:t xml:space="preserve">current scan, MLP head (24,705 params)</w:t>
+                  </w:r>
+                </w:p>
+              </w:tc>
+              <w:tc>
+                <w:tcPr/>
+                <w:p>
+                  <w:pPr>
+                    <w:pStyle w:val="Compact"/>
                     <w:jc w:val="center"/>
                   </w:pPr>
                   <w:r>
-                    <w:t xml:space="preserve">current scan, MLP head (24,705 params)</w:t>
-                  </w:r>
-                </w:p>
-              </w:tc>
-              <w:tc>
-                <w:tcPr/>
-                <w:p>
-                  <w:pPr>
-                    <w:pStyle w:val="Compact"/>
-                    <w:jc w:val="center"/>
-                    <w:jc w:val="center"/>
-                  </w:pPr>
-                  <w:r>
                     <w:t xml:space="preserve">0.670 ± 0.007</w:t>
                   </w:r>
                 </w:p>
@@ -1200,7 +1165,6 @@
                   <w:pPr>
                     <w:pStyle w:val="Compact"/>
                     <w:jc w:val="left"/>
-                    <w:jc w:val="center"/>
                   </w:pPr>
                   <w:r>
                     <w:t xml:space="preserve">not selected</w:t>
@@ -1215,22 +1179,20 @@
                   <w:pPr>
                     <w:pStyle w:val="Compact"/>
                     <w:jc w:val="left"/>
+                  </w:pPr>
+                  <w:r>
+                    <w:t xml:space="preserve">warned negatives weighted ×2</w:t>
+                  </w:r>
+                </w:p>
+              </w:tc>
+              <w:tc>
+                <w:tcPr/>
+                <w:p>
+                  <w:pPr>
+                    <w:pStyle w:val="Compact"/>
                     <w:jc w:val="center"/>
                   </w:pPr>
                   <w:r>
-                    <w:t xml:space="preserve">warned negatives weighted ×2</w:t>
-                  </w:r>
-                </w:p>
-              </w:tc>
-              <w:tc>
-                <w:tcPr/>
-                <w:p>
-                  <w:pPr>
-                    <w:pStyle w:val="Compact"/>
-                    <w:jc w:val="center"/>
-                    <w:jc w:val="center"/>
-                  </w:pPr>
-                  <w:r>
                     <w:t xml:space="preserve">0.656 ± 0.005</w:t>
                   </w:r>
                 </w:p>
@@ -1249,7 +1211,6 @@
                   <w:pPr>
                     <w:pStyle w:val="Compact"/>
                     <w:jc w:val="left"/>
-                    <w:jc w:val="center"/>
                   </w:pPr>
                   <w:r>
                     <w:t xml:space="preserve">not selected</w:t>
@@ -1361,7 +1322,7 @@
             <w:r>
               <w:drawing>
                 <wp:inline>
-                  <wp:extent cx="4160520" cy="1549458"/>
+                  <wp:extent cx="5334000" cy="1986485"/>
                   <wp:effectExtent b="0" l="0" r="0" t="0"/>
                   <wp:docPr descr="" title="" id="24" name="Picture"/>
                   <a:graphic>
@@ -1382,7 +1343,7 @@
                         <pic:spPr bwMode="auto">
                           <a:xfrm>
                             <a:off x="0" y="0"/>
-                            <a:ext cx="4160520" cy="1549458"/>
+                            <a:ext cx="5334000" cy="1986485"/>
                           </a:xfrm>
                           <a:prstGeom prst="rect">
                             <a:avLst/>
@@ -1475,11 +1436,11 @@
               <w:tblLook w:firstRow="1" w:lastRow="0" w:firstColumn="0" w:lastColumn="0" w:noHBand="0" w:noVBand="0" w:val="0020"/>
             </w:tblPr>
             <w:tblGrid>
-              <w:gridCol w:w="1250"/>
-              <w:gridCol w:w="1667"/>
-              <w:gridCol w:w="1667"/>
-              <w:gridCol w:w="1667"/>
-              <w:gridCol w:w="1667"/>
+              <w:gridCol w:w="1788"/>
+              <w:gridCol w:w="1405"/>
+              <w:gridCol w:w="1660"/>
+              <w:gridCol w:w="1405"/>
+              <w:gridCol w:w="1660"/>
             </w:tblGrid>
             <w:tr>
               <w:trPr>
@@ -1491,10 +1452,21 @@
                   <w:pPr>
                     <w:pStyle w:val="Compact"/>
                     <w:jc w:val="left"/>
+                  </w:pPr>
+                  <w:r>
+                    <w:t xml:space="preserve">step</w:t>
+                  </w:r>
+                </w:p>
+              </w:tc>
+              <w:tc>
+                <w:tcPr/>
+                <w:p>
+                  <w:pPr>
+                    <w:pStyle w:val="Compact"/>
                     <w:jc w:val="center"/>
                   </w:pPr>
                   <w:r>
-                    <w:t xml:space="preserve">step</w:t>
+                    <w:t xml:space="preserve">+5 min</w:t>
                   </w:r>
                 </w:p>
               </w:tc>
@@ -1504,35 +1476,20 @@
                   <w:pPr>
                     <w:pStyle w:val="Compact"/>
                     <w:jc w:val="center"/>
+                  </w:pPr>
+                  <w:r>
+                    <w:t xml:space="preserve">paired vs floor</w:t>
+                  </w:r>
+                </w:p>
+              </w:tc>
+              <w:tc>
+                <w:tcPr/>
+                <w:p>
+                  <w:pPr>
+                    <w:pStyle w:val="Compact"/>
                     <w:jc w:val="center"/>
                   </w:pPr>
                   <w:r>
-                    <w:t xml:space="preserve">+5 min</w:t>
-                  </w:r>
-                </w:p>
-              </w:tc>
-              <w:tc>
-                <w:tcPr/>
-                <w:p>
-                  <w:pPr>
-                    <w:pStyle w:val="Compact"/>
-                    <w:jc w:val="center"/>
-                    <w:jc w:val="center"/>
-                  </w:pPr>
-                  <w:r>
-                    <w:t xml:space="preserve">paired vs floor</w:t>
-                  </w:r>
-                </w:p>
-              </w:tc>
-              <w:tc>
-                <w:tcPr/>
-                <w:p>
-                  <w:pPr>
-                    <w:pStyle w:val="Compact"/>
-                    <w:jc w:val="center"/>
-                    <w:jc w:val="center"/>
-                  </w:pPr>
-                  <w:r>
                     <w:t xml:space="preserve">+10 min</w:t>
                   </w:r>
                 </w:p>
@@ -1542,7 +1499,6 @@
                 <w:p>
                   <w:pPr>
                     <w:pStyle w:val="Compact"/>
-                    <w:jc w:val="center"/>
                     <w:jc w:val="center"/>
                   </w:pPr>
                   <w:r>
@@ -1558,22 +1514,20 @@
                   <w:pPr>
                     <w:pStyle w:val="Compact"/>
                     <w:jc w:val="left"/>
+                  </w:pPr>
+                  <w:r>
+                    <w:t xml:space="preserve">0, floor: detector on the newest scan</w:t>
+                  </w:r>
+                </w:p>
+              </w:tc>
+              <w:tc>
+                <w:tcPr/>
+                <w:p>
+                  <w:pPr>
+                    <w:pStyle w:val="Compact"/>
                     <w:jc w:val="center"/>
                   </w:pPr>
                   <w:r>
-                    <w:t xml:space="preserve">0, floor: detector on the newest scan</w:t>
-                  </w:r>
-                </w:p>
-              </w:tc>
-              <w:tc>
-                <w:tcPr/>
-                <w:p>
-                  <w:pPr>
-                    <w:pStyle w:val="Compact"/>
-                    <w:jc w:val="center"/>
-                    <w:jc w:val="center"/>
-                  </w:pPr>
-                  <w:r>
                     <w:t xml:space="preserve">0.731 [0.697, 0.767]</w:t>
                   </w:r>
                 </w:p>
@@ -1591,7 +1545,6 @@
                 <w:p>
                   <w:pPr>
                     <w:pStyle w:val="Compact"/>
-                    <w:jc w:val="center"/>
                     <w:jc w:val="center"/>
                   </w:pPr>
                   <w:r>
@@ -1615,10 +1568,21 @@
                   <w:pPr>
                     <w:pStyle w:val="Compact"/>
                     <w:jc w:val="left"/>
+                  </w:pPr>
+                  <w:r>
+                    <w:t xml:space="preserve">0, ceiling: detector on the future scan</w:t>
+                  </w:r>
+                </w:p>
+              </w:tc>
+              <w:tc>
+                <w:tcPr/>
+                <w:p>
+                  <w:pPr>
+                    <w:pStyle w:val="Compact"/>
                     <w:jc w:val="center"/>
                   </w:pPr>
                   <w:r>
-                    <w:t xml:space="preserve">0, ceiling: detector on the future scan</w:t>
+                    <w:t xml:space="preserve">0.769 [0.734, 0.806]</w:t>
                   </w:r>
                 </w:p>
               </w:tc>
@@ -1628,35 +1592,20 @@
                   <w:pPr>
                     <w:pStyle w:val="Compact"/>
                     <w:jc w:val="center"/>
+                  </w:pPr>
+                  <w:r>
+                    <w:t xml:space="preserve">+0.038 [+0.016, +0.063]</w:t>
+                  </w:r>
+                </w:p>
+              </w:tc>
+              <w:tc>
+                <w:tcPr/>
+                <w:p>
+                  <w:pPr>
+                    <w:pStyle w:val="Compact"/>
                     <w:jc w:val="center"/>
                   </w:pPr>
                   <w:r>
-                    <w:t xml:space="preserve">0.769 [0.734, 0.806]</w:t>
-                  </w:r>
-                </w:p>
-              </w:tc>
-              <w:tc>
-                <w:tcPr/>
-                <w:p>
-                  <w:pPr>
-                    <w:pStyle w:val="Compact"/>
-                    <w:jc w:val="center"/>
-                    <w:jc w:val="center"/>
-                  </w:pPr>
-                  <w:r>
-                    <w:t xml:space="preserve">+0.038 [+0.016, +0.063]</w:t>
-                  </w:r>
-                </w:p>
-              </w:tc>
-              <w:tc>
-                <w:tcPr/>
-                <w:p>
-                  <w:pPr>
-                    <w:pStyle w:val="Compact"/>
-                    <w:jc w:val="center"/>
-                    <w:jc w:val="center"/>
-                  </w:pPr>
-                  <w:r>
                     <w:t xml:space="preserve">0.797 [0.772, 0.822]</w:t>
                   </w:r>
                 </w:p>
@@ -1666,7 +1615,6 @@
                 <w:p>
                   <w:pPr>
                     <w:pStyle w:val="Compact"/>
-                    <w:jc w:val="center"/>
                     <w:jc w:val="center"/>
                   </w:pPr>
                   <w:r>
@@ -1682,10 +1630,21 @@
                   <w:pPr>
                     <w:pStyle w:val="Compact"/>
                     <w:jc w:val="left"/>
+                  </w:pPr>
+                  <w:r>
+                    <w:t xml:space="preserve">3, frozen CNN, two scans, new head</w:t>
+                  </w:r>
+                </w:p>
+              </w:tc>
+              <w:tc>
+                <w:tcPr/>
+                <w:p>
+                  <w:pPr>
+                    <w:pStyle w:val="Compact"/>
                     <w:jc w:val="center"/>
                   </w:pPr>
                   <w:r>
-                    <w:t xml:space="preserve">3, frozen CNN, two scans, new head</w:t>
+                    <w:t xml:space="preserve">0.699 [0.662, 0.737]</w:t>
                   </w:r>
                 </w:p>
               </w:tc>
@@ -1695,35 +1654,20 @@
                   <w:pPr>
                     <w:pStyle w:val="Compact"/>
                     <w:jc w:val="center"/>
+                  </w:pPr>
+                  <w:r>
+                    <w:t xml:space="preserve">−0.032 [−0.045, −0.020]</w:t>
+                  </w:r>
+                </w:p>
+              </w:tc>
+              <w:tc>
+                <w:tcPr/>
+                <w:p>
+                  <w:pPr>
+                    <w:pStyle w:val="Compact"/>
                     <w:jc w:val="center"/>
                   </w:pPr>
                   <w:r>
-                    <w:t xml:space="preserve">0.699 [0.662, 0.737]</w:t>
-                  </w:r>
-                </w:p>
-              </w:tc>
-              <w:tc>
-                <w:tcPr/>
-                <w:p>
-                  <w:pPr>
-                    <w:pStyle w:val="Compact"/>
-                    <w:jc w:val="center"/>
-                    <w:jc w:val="center"/>
-                  </w:pPr>
-                  <w:r>
-                    <w:t xml:space="preserve">−0.032 [−0.045, −0.020]</w:t>
-                  </w:r>
-                </w:p>
-              </w:tc>
-              <w:tc>
-                <w:tcPr/>
-                <w:p>
-                  <w:pPr>
-                    <w:pStyle w:val="Compact"/>
-                    <w:jc w:val="center"/>
-                    <w:jc w:val="center"/>
-                  </w:pPr>
-                  <w:r>
                     <w:t xml:space="preserve">0.710 [0.683, 0.736]</w:t>
                   </w:r>
                 </w:p>
@@ -1733,7 +1677,6 @@
                 <w:p>
                   <w:pPr>
                     <w:pStyle w:val="Compact"/>
-                    <w:jc w:val="center"/>
                     <w:jc w:val="center"/>
                   </w:pPr>
                   <w:r>
@@ -1749,10 +1692,21 @@
                   <w:pPr>
                     <w:pStyle w:val="Compact"/>
                     <w:jc w:val="left"/>
+                  </w:pPr>
+                  <w:r>
+                    <w:t xml:space="preserve">4, fine-tuned CNN, two scans, new head</w:t>
+                  </w:r>
+                </w:p>
+              </w:tc>
+              <w:tc>
+                <w:tcPr/>
+                <w:p>
+                  <w:pPr>
+                    <w:pStyle w:val="Compact"/>
                     <w:jc w:val="center"/>
                   </w:pPr>
                   <w:r>
-                    <w:t xml:space="preserve">4, fine-tuned CNN, two scans, new head</w:t>
+                    <w:t xml:space="preserve">0.724 [0.689, 0.762]</w:t>
                   </w:r>
                 </w:p>
               </w:tc>
@@ -1762,35 +1716,20 @@
                   <w:pPr>
                     <w:pStyle w:val="Compact"/>
                     <w:jc w:val="center"/>
+                  </w:pPr>
+                  <w:r>
+                    <w:t xml:space="preserve">−0.007 [−0.031, +0.015]</w:t>
+                  </w:r>
+                </w:p>
+              </w:tc>
+              <w:tc>
+                <w:tcPr/>
+                <w:p>
+                  <w:pPr>
+                    <w:pStyle w:val="Compact"/>
                     <w:jc w:val="center"/>
                   </w:pPr>
                   <w:r>
-                    <w:t xml:space="preserve">0.724 [0.689, 0.762]</w:t>
-                  </w:r>
-                </w:p>
-              </w:tc>
-              <w:tc>
-                <w:tcPr/>
-                <w:p>
-                  <w:pPr>
-                    <w:pStyle w:val="Compact"/>
-                    <w:jc w:val="center"/>
-                    <w:jc w:val="center"/>
-                  </w:pPr>
-                  <w:r>
-                    <w:t xml:space="preserve">−0.007 [−0.031, +0.015]</w:t>
-                  </w:r>
-                </w:p>
-              </w:tc>
-              <w:tc>
-                <w:tcPr/>
-                <w:p>
-                  <w:pPr>
-                    <w:pStyle w:val="Compact"/>
-                    <w:jc w:val="center"/>
-                    <w:jc w:val="center"/>
-                  </w:pPr>
-                  <w:r>
                     <w:t xml:space="preserve">0.728 [0.701, 0.752]</w:t>
                   </w:r>
                 </w:p>
@@ -1800,7 +1739,6 @@
                 <w:p>
                   <w:pPr>
                     <w:pStyle w:val="Compact"/>
-                    <w:jc w:val="center"/>
                     <w:jc w:val="center"/>
                   </w:pPr>
                   <w:r>
@@ -1869,7 +1807,7 @@
             <w:r>
               <w:drawing>
                 <wp:inline>
-                  <wp:extent cx="3093720" cy="1237488"/>
+                  <wp:extent cx="5334000" cy="2133600"/>
                   <wp:effectExtent b="0" l="0" r="0" t="0"/>
                   <wp:docPr descr="" title="" id="30" name="Picture"/>
                   <a:graphic>
@@ -1890,7 +1828,7 @@
                         <pic:spPr bwMode="auto">
                           <a:xfrm>
                             <a:off x="0" y="0"/>
-                            <a:ext cx="3093720" cy="1237488"/>
+                            <a:ext cx="5334000" cy="2133600"/>
                           </a:xfrm>
                           <a:prstGeom prst="rect">
                             <a:avLst/>

</xml_diff>